<commit_message>
Use case and nav edits
</commit_message>
<xml_diff>
--- a/en/data-mobilization/modules/ROOT/attachments/UC-BL-exercise-sheet_EN.docx
+++ b/en/data-mobilization/modules/ROOT/attachments/UC-BL-exercise-sheet_EN.docx
@@ -620,7 +620,13 @@
               <w:rPr>
                 <w:b/>
               </w:rPr>
-              <w:t>Link to the result spreadsheet</w:t>
+              <w:t>Filename of</w:t>
+            </w:r>
+            <w:r>
+              <w:rPr>
+                <w:b/>
+              </w:rPr>
+              <w:t xml:space="preserve"> the result spreadsheet</w:t>
             </w:r>
           </w:p>
         </w:tc>
@@ -1057,7 +1063,13 @@
               <w:rPr>
                 <w:b/>
               </w:rPr>
-              <w:t>Link to the result spreadsheet</w:t>
+              <w:t>Filename of</w:t>
+            </w:r>
+            <w:r>
+              <w:rPr>
+                <w:b/>
+              </w:rPr>
+              <w:t xml:space="preserve"> the result spreadsheet</w:t>
             </w:r>
           </w:p>
         </w:tc>
@@ -1667,9 +1679,10 @@
     <w:sectPr>
       <w:headerReference w:type="even" r:id="rId8"/>
       <w:headerReference w:type="default" r:id="rId9"/>
-      <w:footerReference w:type="default" r:id="rId10"/>
-      <w:headerReference w:type="first" r:id="rId11"/>
-      <w:footerReference w:type="first" r:id="rId12"/>
+      <w:footerReference w:type="even" r:id="rId10"/>
+      <w:footerReference w:type="default" r:id="rId11"/>
+      <w:headerReference w:type="first" r:id="rId12"/>
+      <w:footerReference w:type="first" r:id="rId13"/>
       <w:pgSz w:w="11906" w:h="16838"/>
       <w:pgMar w:top="1656" w:right="360" w:bottom="360" w:left="360" w:header="720" w:footer="576" w:gutter="0"/>
       <w:pgNumType w:start="1"/>
@@ -1709,162 +1722,8 @@
 <w:ftr xmlns:wpc="http://schemas.microsoft.com/office/word/2010/wordprocessingCanvas" xmlns:cx="http://schemas.microsoft.com/office/drawing/2014/chartex" xmlns:cx1="http://schemas.microsoft.com/office/drawing/2015/9/8/chartex" xmlns:cx2="http://schemas.microsoft.com/office/drawing/2015/10/21/chartex" xmlns:cx3="http://schemas.microsoft.com/office/drawing/2016/5/9/chartex" xmlns:cx4="http://schemas.microsoft.com/office/drawing/2016/5/10/chartex" xmlns:cx5="http://schemas.microsoft.com/office/drawing/2016/5/11/chartex" xmlns:cx6="http://schemas.microsoft.com/office/drawing/2016/5/12/chartex" xmlns:cx7="http://schemas.microsoft.com/office/drawing/2016/5/13/chartex" xmlns:cx8="http://schemas.microsoft.com/office/drawing/2016/5/14/chartex" xmlns:mc="http://schemas.openxmlformats.org/markup-compatibility/2006" xmlns:aink="http://schemas.microsoft.com/office/drawing/2016/ink" xmlns:am3d="http://schemas.microsoft.com/office/drawing/2017/model3d" xmlns:o="urn:schemas-microsoft-com:office:office" xmlns:oel="http://schemas.microsoft.com/office/2019/extlst" xmlns:r="http://schemas.openxmlformats.org/officeDocument/2006/relationships" xmlns:m="http://schemas.openxmlformats.org/officeDocument/2006/math" xmlns:v="urn:schemas-microsoft-com:vml" xmlns:wp14="http://schemas.microsoft.com/office/word/2010/wordprocessingDrawing" xmlns:wp="http://schemas.openxmlformats.org/drawingml/2006/wordprocessingDrawing" xmlns:w10="urn:schemas-microsoft-com:office:word" xmlns:w="http://schemas.openxmlformats.org/wordprocessingml/2006/main" xmlns:w14="http://schemas.microsoft.com/office/word/2010/wordml" xmlns:w15="http://schemas.microsoft.com/office/word/2012/wordml" xmlns:w16cex="http://schemas.microsoft.com/office/word/2018/wordml/cex" xmlns:w16cid="http://schemas.microsoft.com/office/word/2016/wordml/cid" xmlns:w16="http://schemas.microsoft.com/office/word/2018/wordml" xmlns:w16du="http://schemas.microsoft.com/office/word/2023/wordml/word16du" xmlns:w16sdtdh="http://schemas.microsoft.com/office/word/2020/wordml/sdtdatahash" xmlns:w16sdtfl="http://schemas.microsoft.com/office/word/2024/wordml/sdtformatlock" xmlns:w16se="http://schemas.microsoft.com/office/word/2015/wordml/symex" xmlns:wpg="http://schemas.microsoft.com/office/word/2010/wordprocessingGroup" xmlns:wpi="http://schemas.microsoft.com/office/word/2010/wordprocessingInk" xmlns:wne="http://schemas.microsoft.com/office/word/2006/wordml" xmlns:wps="http://schemas.microsoft.com/office/word/2010/wordprocessingShape" mc:Ignorable="w14 w15 w16se w16cid w16 w16cex w16sdtdh w16sdtfl w16du wp14">
   <w:p>
     <w:pPr>
-      <w:spacing w:after="0"/>
+      <w:pStyle w:val="Footer"/>
     </w:pPr>
-    <w:r>
-      <w:rPr>
-        <w:color w:val="666666"/>
-        <w:sz w:val="18"/>
-        <w:szCs w:val="18"/>
-      </w:rPr>
-      <w:t>Biodiversity Data Mobilization</w:t>
-    </w:r>
-    <w:r>
-      <w:rPr>
-        <w:color w:val="666666"/>
-        <w:sz w:val="18"/>
-        <w:szCs w:val="18"/>
-      </w:rPr>
-      <w:tab/>
-    </w:r>
-    <w:r>
-      <w:rPr>
-        <w:color w:val="666666"/>
-        <w:sz w:val="18"/>
-        <w:szCs w:val="18"/>
-      </w:rPr>
-      <w:tab/>
-    </w:r>
-    <w:r>
-      <w:rPr>
-        <w:color w:val="666666"/>
-        <w:sz w:val="18"/>
-        <w:szCs w:val="18"/>
-      </w:rPr>
-      <w:tab/>
-    </w:r>
-    <w:r>
-      <w:rPr>
-        <w:color w:val="666666"/>
-        <w:sz w:val="18"/>
-        <w:szCs w:val="18"/>
-      </w:rPr>
-      <w:t xml:space="preserve">Use case </w:t>
-    </w:r>
-    <w:r>
-      <w:rPr>
-        <w:color w:val="666666"/>
-        <w:sz w:val="18"/>
-        <w:szCs w:val="18"/>
-      </w:rPr>
-      <w:t>birds from literature</w:t>
-    </w:r>
-    <w:r>
-      <w:rPr>
-        <w:color w:val="666666"/>
-        <w:sz w:val="18"/>
-        <w:szCs w:val="18"/>
-      </w:rPr>
-      <w:t xml:space="preserve"> - </w:t>
-    </w:r>
-    <w:r>
-      <w:rPr>
-        <w:color w:val="666666"/>
-        <w:sz w:val="18"/>
-        <w:szCs w:val="18"/>
-      </w:rPr>
-      <w:t>e</w:t>
-    </w:r>
-    <w:r>
-      <w:rPr>
-        <w:color w:val="666666"/>
-        <w:sz w:val="18"/>
-        <w:szCs w:val="18"/>
-      </w:rPr>
-      <w:t xml:space="preserve">xercise </w:t>
-    </w:r>
-    <w:r>
-      <w:rPr>
-        <w:color w:val="666666"/>
-        <w:sz w:val="18"/>
-        <w:szCs w:val="18"/>
-      </w:rPr>
-      <w:t>s</w:t>
-    </w:r>
-    <w:r>
-      <w:rPr>
-        <w:color w:val="666666"/>
-        <w:sz w:val="18"/>
-        <w:szCs w:val="18"/>
-      </w:rPr>
-      <w:t>heet</w:t>
-    </w:r>
-    <w:r>
-      <w:rPr>
-        <w:i/>
-        <w:sz w:val="18"/>
-        <w:szCs w:val="18"/>
-      </w:rPr>
-      <w:tab/>
-    </w:r>
-    <w:r>
-      <w:rPr>
-        <w:i/>
-        <w:sz w:val="18"/>
-        <w:szCs w:val="18"/>
-      </w:rPr>
-      <w:tab/>
-    </w:r>
-    <w:r>
-      <w:rPr>
-        <w:i/>
-        <w:sz w:val="18"/>
-        <w:szCs w:val="18"/>
-      </w:rPr>
-      <w:tab/>
-      <w:t xml:space="preserve">Page </w:t>
-    </w:r>
-    <w:r>
-      <w:rPr>
-        <w:i/>
-        <w:sz w:val="18"/>
-        <w:szCs w:val="18"/>
-      </w:rPr>
-      <w:fldChar w:fldCharType="begin"/>
-    </w:r>
-    <w:r>
-      <w:rPr>
-        <w:i/>
-        <w:sz w:val="18"/>
-        <w:szCs w:val="18"/>
-      </w:rPr>
-      <w:instrText>PAGE</w:instrText>
-    </w:r>
-    <w:r>
-      <w:rPr>
-        <w:i/>
-        <w:sz w:val="18"/>
-        <w:szCs w:val="18"/>
-      </w:rPr>
-      <w:fldChar w:fldCharType="separate"/>
-    </w:r>
-    <w:r>
-      <w:rPr>
-        <w:i/>
-        <w:noProof/>
-        <w:sz w:val="18"/>
-        <w:szCs w:val="18"/>
-      </w:rPr>
-      <w:t>2</w:t>
-    </w:r>
-    <w:r>
-      <w:rPr>
-        <w:i/>
-        <w:sz w:val="18"/>
-        <w:szCs w:val="18"/>
-      </w:rPr>
-      <w:fldChar w:fldCharType="end"/>
-    </w:r>
   </w:p>
 </w:ftr>
 </file>
@@ -1874,11 +1733,175 @@
   <w:p>
     <w:pPr>
       <w:spacing w:after="0"/>
+    </w:pPr>
+    <w:r>
+      <w:rPr>
+        <w:color w:val="666666"/>
+        <w:sz w:val="18"/>
+        <w:szCs w:val="18"/>
+      </w:rPr>
+      <w:t>Biodiversity Data Mobilization</w:t>
+    </w:r>
+    <w:r>
+      <w:rPr>
+        <w:color w:val="666666"/>
+        <w:sz w:val="18"/>
+        <w:szCs w:val="18"/>
+      </w:rPr>
+      <w:tab/>
+    </w:r>
+    <w:r>
+      <w:rPr>
+        <w:color w:val="666666"/>
+        <w:sz w:val="18"/>
+        <w:szCs w:val="18"/>
+      </w:rPr>
+      <w:tab/>
+    </w:r>
+    <w:r>
+      <w:rPr>
+        <w:color w:val="666666"/>
+        <w:sz w:val="18"/>
+        <w:szCs w:val="18"/>
+      </w:rPr>
+      <w:tab/>
+    </w:r>
+    <w:r>
+      <w:rPr>
+        <w:color w:val="666666"/>
+        <w:sz w:val="18"/>
+        <w:szCs w:val="18"/>
+      </w:rPr>
+      <w:t xml:space="preserve">Use case </w:t>
+    </w:r>
+    <w:r>
+      <w:rPr>
+        <w:color w:val="666666"/>
+        <w:sz w:val="18"/>
+        <w:szCs w:val="18"/>
+      </w:rPr>
+      <w:t>birds from literature</w:t>
+    </w:r>
+    <w:r>
+      <w:rPr>
+        <w:color w:val="666666"/>
+        <w:sz w:val="18"/>
+        <w:szCs w:val="18"/>
+      </w:rPr>
+      <w:t xml:space="preserve"> - </w:t>
+    </w:r>
+    <w:r>
+      <w:rPr>
+        <w:color w:val="666666"/>
+        <w:sz w:val="18"/>
+        <w:szCs w:val="18"/>
+      </w:rPr>
+      <w:t>e</w:t>
+    </w:r>
+    <w:r>
+      <w:rPr>
+        <w:color w:val="666666"/>
+        <w:sz w:val="18"/>
+        <w:szCs w:val="18"/>
+      </w:rPr>
+      <w:t xml:space="preserve">xercise </w:t>
+    </w:r>
+    <w:r>
+      <w:rPr>
+        <w:color w:val="666666"/>
+        <w:sz w:val="18"/>
+        <w:szCs w:val="18"/>
+      </w:rPr>
+      <w:t>s</w:t>
+    </w:r>
+    <w:r>
+      <w:rPr>
+        <w:color w:val="666666"/>
+        <w:sz w:val="18"/>
+        <w:szCs w:val="18"/>
+      </w:rPr>
+      <w:t>heet</w:t>
+    </w:r>
+    <w:r>
       <w:rPr>
         <w:i/>
         <w:sz w:val="18"/>
         <w:szCs w:val="18"/>
       </w:rPr>
+      <w:tab/>
+    </w:r>
+    <w:r>
+      <w:rPr>
+        <w:i/>
+        <w:sz w:val="18"/>
+        <w:szCs w:val="18"/>
+      </w:rPr>
+      <w:tab/>
+    </w:r>
+    <w:r>
+      <w:rPr>
+        <w:i/>
+        <w:sz w:val="18"/>
+        <w:szCs w:val="18"/>
+      </w:rPr>
+      <w:tab/>
+      <w:t xml:space="preserve">Page </w:t>
+    </w:r>
+    <w:r>
+      <w:rPr>
+        <w:i/>
+        <w:sz w:val="18"/>
+        <w:szCs w:val="18"/>
+      </w:rPr>
+      <w:fldChar w:fldCharType="begin"/>
+    </w:r>
+    <w:r>
+      <w:rPr>
+        <w:i/>
+        <w:sz w:val="18"/>
+        <w:szCs w:val="18"/>
+      </w:rPr>
+      <w:instrText>PAGE</w:instrText>
+    </w:r>
+    <w:r>
+      <w:rPr>
+        <w:i/>
+        <w:sz w:val="18"/>
+        <w:szCs w:val="18"/>
+      </w:rPr>
+      <w:fldChar w:fldCharType="separate"/>
+    </w:r>
+    <w:r>
+      <w:rPr>
+        <w:i/>
+        <w:noProof/>
+        <w:sz w:val="18"/>
+        <w:szCs w:val="18"/>
+      </w:rPr>
+      <w:t>2</w:t>
+    </w:r>
+    <w:r>
+      <w:rPr>
+        <w:i/>
+        <w:sz w:val="18"/>
+        <w:szCs w:val="18"/>
+      </w:rPr>
+      <w:fldChar w:fldCharType="end"/>
+    </w:r>
+  </w:p>
+</w:ftr>
+</file>
+
+<file path=word/footer3.xml><?xml version="1.0" encoding="utf-8"?>
+<w:ftr xmlns:wpc="http://schemas.microsoft.com/office/word/2010/wordprocessingCanvas" xmlns:cx="http://schemas.microsoft.com/office/drawing/2014/chartex" xmlns:cx1="http://schemas.microsoft.com/office/drawing/2015/9/8/chartex" xmlns:cx2="http://schemas.microsoft.com/office/drawing/2015/10/21/chartex" xmlns:cx3="http://schemas.microsoft.com/office/drawing/2016/5/9/chartex" xmlns:cx4="http://schemas.microsoft.com/office/drawing/2016/5/10/chartex" xmlns:cx5="http://schemas.microsoft.com/office/drawing/2016/5/11/chartex" xmlns:cx6="http://schemas.microsoft.com/office/drawing/2016/5/12/chartex" xmlns:cx7="http://schemas.microsoft.com/office/drawing/2016/5/13/chartex" xmlns:cx8="http://schemas.microsoft.com/office/drawing/2016/5/14/chartex" xmlns:mc="http://schemas.openxmlformats.org/markup-compatibility/2006" xmlns:aink="http://schemas.microsoft.com/office/drawing/2016/ink" xmlns:am3d="http://schemas.microsoft.com/office/drawing/2017/model3d" xmlns:o="urn:schemas-microsoft-com:office:office" xmlns:oel="http://schemas.microsoft.com/office/2019/extlst" xmlns:r="http://schemas.openxmlformats.org/officeDocument/2006/relationships" xmlns:m="http://schemas.openxmlformats.org/officeDocument/2006/math" xmlns:v="urn:schemas-microsoft-com:vml" xmlns:wp14="http://schemas.microsoft.com/office/word/2010/wordprocessingDrawing" xmlns:wp="http://schemas.openxmlformats.org/drawingml/2006/wordprocessingDrawing" xmlns:w10="urn:schemas-microsoft-com:office:word" xmlns:w="http://schemas.openxmlformats.org/wordprocessingml/2006/main" xmlns:w14="http://schemas.microsoft.com/office/word/2010/wordml" xmlns:w15="http://schemas.microsoft.com/office/word/2012/wordml" xmlns:w16cex="http://schemas.microsoft.com/office/word/2018/wordml/cex" xmlns:w16cid="http://schemas.microsoft.com/office/word/2016/wordml/cid" xmlns:w16="http://schemas.microsoft.com/office/word/2018/wordml" xmlns:w16du="http://schemas.microsoft.com/office/word/2023/wordml/word16du" xmlns:w16sdtdh="http://schemas.microsoft.com/office/word/2020/wordml/sdtdatahash" xmlns:w16sdtfl="http://schemas.microsoft.com/office/word/2024/wordml/sdtformatlock" xmlns:w16se="http://schemas.microsoft.com/office/word/2015/wordml/symex" xmlns:wpg="http://schemas.microsoft.com/office/word/2010/wordprocessingGroup" xmlns:wpi="http://schemas.microsoft.com/office/word/2010/wordprocessingInk" xmlns:wne="http://schemas.microsoft.com/office/word/2006/wordml" xmlns:wps="http://schemas.microsoft.com/office/word/2010/wordprocessingShape" mc:Ignorable="w14 w15 w16se w16cid w16 w16cex w16sdtdh w16sdtfl w16du wp14">
+  <w:p>
+    <w:pPr>
+      <w:spacing w:after="0"/>
+      <w:rPr>
+        <w:i/>
+        <w:sz w:val="18"/>
+        <w:szCs w:val="18"/>
+      </w:rPr>
     </w:pPr>
     <w:r>
       <w:rPr>
@@ -1911,13 +1934,6 @@
         <w:szCs w:val="18"/>
       </w:rPr>
       <w:tab/>
-    </w:r>
-    <w:r>
-      <w:rPr>
-        <w:color w:val="666666"/>
-        <w:sz w:val="18"/>
-        <w:szCs w:val="18"/>
-      </w:rPr>
       <w:t>Use case birds from literature - exercise sheet</w:t>
     </w:r>
     <w:r>

</xml_diff>